<commit_message>
Ispravljen vremenski okvir: sve završeno do kraja augusta, prije septembarskog roka
</commit_message>
<xml_diff>
--- a/public/docs/CityIce-Prijedlog-marketinskih-aktivnosti.docx
+++ b/public/docs/CityIce-Prijedlog-marketinskih-aktivnosti.docx
@@ -196,7 +196,7 @@
         <w:t xml:space="preserve">Važna napomena o obimu: </w:t>
       </w:r>
       <w:r>
-        <w:t xml:space="preserve">zbog strogog vremenskog okvira projekta (rok predaje je prije početka novogodišnje sezone, a sve aktivnosti radi jedna osoba uz redovne obaveze), prijedlog je </w:t>
+        <w:t xml:space="preserve">zbog strogog vremenskog okvira projekta (sve mora biti završeno do kraja augusta, prije septembarskog roka, a aktivnosti radi jedna osoba uz redovne obaveze), prijedlog je </w:t>
       </w:r>
       <w:r>
         <w:rPr>
@@ -662,7 +662,7 @@
         <w:t xml:space="preserve">ograničenog vremena</w:t>
       </w:r>
       <w:r>
-        <w:t xml:space="preserve"> (projekat mora biti završen u toku jednog semestra, a kampanjski materijali prije decembra) sljedeće aktivnosti su svjesno ostavljene za neku buduću saradnju:</w:t>
+        <w:t xml:space="preserve"> (sve mora biti gotovo do kraja augusta, prije septembarskog roka) sljedeće aktivnosti su svjesno ostavljene za neku buduću saradnju:</w:t>
       </w:r>
     </w:p>
     <w:p>

</xml_diff>